<commit_message>
Fix PDF rendering: figure titles/overflow, loose \footnotesize, add panel degrees
- Figures: drop the baked-in Portuguese titles (the LaTeX \caption already names
  them) and anglicize axis labels/legend (Fig. 2: "% of feedback turns",
  "Model/Specialists"); save with bbox_inches="tight" so no text exceeds the
  image box (Fig. 2's long title was overflowing the page margin). Regenerate
  both figures into analises/ and paper/jbcs/.
- Converters (tex_to_pdf.py, tex_to_docx.py): strip typeset-only font-size and
  alignment switches (\footnotesize, \small, \centering, ...) so they no longer
  leak as loose text between \begin{table*} and \begin{tabular} (Table 1).
- Acknowledgements: add the panelists' degrees (Simone Rosanelli Dullius, M.Sc.;
  Tatiane Braga dos Reis, M.Sc.; Prof. Dr. Carlos Alberto Faraco).
- Regenerate .docx/.pdf.

Co-Authored-By: Claude Opus 4.8 (1M context) <noreply@anthropic.com>
</commit_message>
<xml_diff>
--- a/paper/jbcs/benchmark_slm_jbcs.docx
+++ b/paper/jbcs/benchmark_slm_jbcs.docx
@@ -711,15 +711,6 @@
           <w:i w:val="0"/>
         </w:rPr>
         <w:t xml:space="preserve"> (Lima Barreto, 1956)—selected for their potential to foster different reading, interpretation, and writing skills. From these works, synthetic scenarios were developed, each incorporating a predefined textual phenomenon for the purposes of this investigation. Three scenarios (S11–S13) were intentionally written as high-quality texts, serving as positive controls, to investigate how specialists mediate writing that already satisfies the expected textual criteria, shifting the focus from error correction to expansion, reflection, and learner autonomy. Table 1 synthesizes the thirteen scenarios along four dimensions: the literary source, the proposed school task, the deliberately planted textual phenomenon, and the pedagogical objective each scenario is meant to probe.</w:t>
-      </w:r>
-    </w:p>
-    <w:p>
-      <w:r>
-        <w:rPr>
-          <w:b w:val="0"/>
-          <w:i w:val="0"/>
-        </w:rPr>
-        <w:t>footnotesize</w:t>
       </w:r>
     </w:p>
     <w:p>
@@ -9588,7 +9579,7 @@
       <w:r>
         <w:drawing>
           <wp:inline xmlns:a="http://schemas.openxmlformats.org/drawingml/2006/main" xmlns:pic="http://schemas.openxmlformats.org/drawingml/2006/picture">
-            <wp:extent cx="5303520" cy="2121408"/>
+            <wp:extent cx="5303520" cy="2086789"/>
             <wp:docPr id="1" name="Picture 1"/>
             <wp:cNvGraphicFramePr>
               <a:graphicFrameLocks noChangeAspect="1"/>
@@ -9609,7 +9600,7 @@
                   <pic:spPr>
                     <a:xfrm>
                       <a:off x="0" y="0"/>
-                      <a:ext cx="5303520" cy="2121408"/>
+                      <a:ext cx="5303520" cy="2086789"/>
                     </a:xfrm>
                     <a:prstGeom prst="rect"/>
                   </pic:spPr>
@@ -11153,7 +11144,7 @@
       <w:r>
         <w:drawing>
           <wp:inline xmlns:a="http://schemas.openxmlformats.org/drawingml/2006/main" xmlns:pic="http://schemas.openxmlformats.org/drawingml/2006/picture">
-            <wp:extent cx="5303520" cy="2253996"/>
+            <wp:extent cx="5303520" cy="2222199"/>
             <wp:docPr id="2" name="Picture 2"/>
             <wp:cNvGraphicFramePr>
               <a:graphicFrameLocks noChangeAspect="1"/>
@@ -11174,7 +11165,7 @@
                   <pic:spPr>
                     <a:xfrm>
                       <a:off x="0" y="0"/>
-                      <a:ext cx="5303520" cy="2253996"/>
+                      <a:ext cx="5303520" cy="2222199"/>
                     </a:xfrm>
                     <a:prstGeom prst="rect"/>
                   </pic:spPr>
@@ -12369,7 +12360,7 @@
           <w:b w:val="0"/>
           <w:i w:val="0"/>
         </w:rPr>
-        <w:t>The authors thank the Graduate Program in Informatics in Education (PPGIE) of the Federal University of Rio Grande do Sul (UFRGS) for the institutional environment that made this research possible. We are especially grateful to the five Portuguese-language specialists who composed the expert panel and produced the 65 written feedback turns that constitute the human reference of this study, a substantial contribution to the research. Among those who authorized identification, we thank Simone Rosanelli Dullius, Tatiane Braga dos Reis, and Carlos Alberto Faraco; we also thank the remaining panelists, who preferred to remain anonymous, for their equally valuable contribution.</w:t>
+        <w:t>The authors thank the Graduate Program in Informatics in Education (PPGIE) of the Federal University of Rio Grande do Sul (UFRGS) for the institutional environment that made this research possible. We are especially grateful to the five Portuguese-language specialists who composed the expert panel and produced the 65 written feedback turns that constitute the human reference of this study, a substantial contribution to the research. Among those who authorized identification, we thank Simone Rosanelli Dullius, M.Sc., Tatiane Braga dos Reis, M.Sc., and Prof. Dr. Carlos Alberto Faraco; we also thank the remaining panelists, who preferred to remain anonymous, for their equally valuable contribution.</w:t>
       </w:r>
     </w:p>
     <w:p>

</xml_diff>